<commit_message>
add 10.29 media briefing docx
</commit_message>
<xml_diff>
--- a/10.29媒体信息摘报.docx
+++ b/10.29媒体信息摘报.docx
@@ -54,7 +54,7 @@
         <w:rPr>
           <w:rFonts w:ascii="仿宋_GB2312" w:hAnsi="仿宋_GB2312" w:eastAsia="仿宋_GB2312"/>
         </w:rPr>
-        <w:t>山东省日前印发《2026年促进经济“稳中求进、提质增效”政策清单（第二批）》，围绕推动投资尽快回稳推出9条政策措施，涉及政策性资金使用、科技成果转化、融资支持、要素保障等多个方面。一是临时用地接续使用。对纳入国家和省级重点项目清单的交通、能源、水利等基础设施项目，其依法获得批准的临时用地用林用草，在复垦（植被恢复）期满前，经省级确认后允许不同施工标段接续使用，累计使用期限不超过项目批准的施工周期，减少重复占地和手续办理。二是设立政策性资金管理奖励专项。省级安排5000万元，综合评估各市2026年中央预算内投资、超长期特别国债、新型政策性金融工具资金使用管理情况，对成效好、进展快、综合效益明显的5个市分别安排1500万元、1200万元、1000万元、800万元、500万元，用于支持社会民生、城市更新等补短板项目建设。三是布局概念验证中心和中试基地。面向具身智能、脑机接口、商业航天、工业母机、高端软件等重点领域和标志性产业链，布局建设一批省级概念验证中心和中试基地，对符合条件的依法依规给予政策支持。四是简化环评手续。各市可视情将规划环评与项目环评联动试点范围申请扩大至全省已开展规划环评的所有国家级园区及具备条件的省级园区，简化单个建设项目环评手续；济宁高新区一高端装备项目环评表降级为登记备案，办理时间由数十个工作日缩短至即时办结。五是拓展应收账款融资。允许建筑业企业将已确认的工程项目（含PPP项目）应收账款作为资产办理质押或转让，融资比例由金融机构和地方金融组织根据基础资产质量合理确定。</w:t>
+        <w:t>山东省印发《2026年促进经济“稳中求进、提质增效”政策清单（第二批）》，围绕推动投资回稳推出9条政策措施，涵盖政策性资金、科技成果转化、融资与要素保障等。一是临时用地接续使用。对纳入国家和省级重点项目清单的交通、能源、水利等基础设施项目，其依法获批的临时用地用林用草，在复垦期满前经省级确认后允许不同施工标段接续使用，累计不超过项目批准施工周期，减少重复占地与手续办理。二是设立政策性资金管理奖励专项。省级安排5000万元，综合评估各市中央预算内投资、超长期特别国债、新型政策性金融工具使用情况，对成效好的5个市分别安排1500万元、1200万元、1000万元、800万元、500万元，用于社会民生、城市更新等补短板项目。三是布局概念验证中心和中试基地。面向具身智能、脑机接口、商业航天、工业母机、高端软件等重点领域和标志性产业链，布局建设一批省级概念验证中心和中试基地，符合条件的依法依规给予政策支持。四是简化环评手续。各市可将规划环评与项目环评联动试点扩大至全省已开展规划环评的国家级园区及具备条件的省级园区，简化单个项目环评；济宁高新区一高端装备项目环评由表降级为登记备案，办理由数十个工作日缩至即时办结。五是拓展应收账款融资。允许建筑业企业将已确认的工程项目（含PPP项目）应收账款作为资产办理质押或转让，融资比例由金融机构和地方金融组织按基础资产质量合理确定。</w:t>
       </w:r>
     </w:p>
     <w:p>
@@ -135,7 +135,7 @@
         <w:rPr>
           <w:rFonts w:ascii="仿宋_GB2312" w:hAnsi="仿宋_GB2312" w:eastAsia="仿宋_GB2312"/>
         </w:rPr>
-        <w:t>北京市把企业“找人、找钱、找市场、找出海通道”需求转化为政策供给与贴心服务，以“母港”定位为出海企业提供泊位、补给与航图。一是上线“一带一路”直通车平台。去年7月正式上线，哪国市场空间大、哪区域政策风险高，企业一目了然。二是布局线下出海会客厅。在企業集中区域陆续开设信保会客厅、CBD会客厅、数字丝路会客厅、海淀科创出海会客厅、亦庄新质出海会客厅，通过差异化定位精准服务。三是形成服务闭环。一套“活动引流—会客厅接诊—工单流转—服务转化”的闭环机制正在形成，从源头减少出海试错成本。四是办好京洽会平台。10月29日2026北京国际投资贸易洽谈会开幕，作为兼具投资、贸易、出海与场景的综合型平台，帮助“硬科技”企业破解出海面临的信息不对称、资源协同成本高等核心难题。五是完善制度供给。《北京市“十五五”时期高水平开放型经济发展规划》引导出海龙头企业及中小企业合理有序布局海外业务；服贸会首次搭建出海服务推介路演区，提供“一站式”专业服务；发布数字经济企业“出海十条”；加快出台会客厅运行管理办法和专业服务机构管理规则。</w:t>
+        <w:t>北京市把企业“找人、找钱、找市场、找出海通道”需求转化为政策供给与贴心服务，以“母港”定位为出海企业提供泊位、补给与航图。一是上线“一带一路”直通车平台。去年7月正式上线，提供重点国别市场空间、政策风险、合规要点与合作伙伴匹配，企业一目了然。二是布局线下出海会客厅。在企业集中区域陆续开设信保会客厅、CBD会客厅、数字丝路会客厅、海淀科创出海会客厅、亦庄新质出海会客厅，提供法律、税务、融资、合规一站式服务，通过差异化定位精准服务。三是形成服务闭环。一套“活动引流—会客厅接诊—工单流转—服务转化”的闭环机制正在形成，把分散的咨询、对接、落地环节串起来，从源头减少出海试错成本。四是办好京洽会平台。10月29日2026北京国际投资贸易洽谈会开幕，作为兼具投资、贸易、出海与场景的综合型平台，帮助“硬科技”企业破解出海面临的信息不对称、资源协同成本高等核心难题。五是完善制度供给。《北京市“十五五”时期高水平开放型经济发展规划》引导出海龙头企业及中小企业合理有序布局海外业务；服贸会首次搭建出海服务推介路演区，提供“一站式”专业服务；发布数字经济企业“出海十条”，涵盖境外投资、数据跨境、外汇结算等；加快出台会客厅运行管理办法和专业服务机构管理规则。</w:t>
       </w:r>
     </w:p>
     <w:p>

</xml_diff>